<commit_message>
Add all project files to integration branch
</commit_message>
<xml_diff>
--- a/inputs/Software_req.docx
+++ b/inputs/Software_req.docx
@@ -2659,7 +2659,7 @@
           </w:tcPr>
           <w:p>
             <w:r>
-              <w:t>SCU_STC_SRS_610</w:t>
+              <w:t>SCU_STC_SrS_610</w:t>
             </w:r>
           </w:p>
         </w:tc>
@@ -2766,6 +2766,283 @@
               <w:t>Where Debounced_EHSV1_Fail is defined in SCU_STC_SRS_164 from Raw_EHSV1_Fail defined in SCU_STC_SRS_124</w:t>
             </w:r>
           </w:p>
+        </w:tc>
+      </w:tr>
+      <w:tr>
+        <w:tc>
+          <w:tcPr>
+            <w:tcW w:type="dxa" w:w="4320"/>
+          </w:tcPr>
+          <w:p>
+            <w:r>
+              <w:t>SCU_STC_SRS_1</w:t>
+            </w:r>
+          </w:p>
+        </w:tc>
+        <w:tc>
+          <w:tcPr>
+            <w:tcW w:type="dxa" w:w="4320"/>
+          </w:tcPr>
+          <w:p/>
+          <w:p>
+            <w:r>
+              <w:t>The SCU software shall implement the following state logic:</w:t>
+            </w:r>
+          </w:p>
+          <w:p>
+            <w:r>
+              <w:t>INITIAL_STATE = NORMAL</w:t>
+            </w:r>
+          </w:p>
+          <w:p>
+            <w:r>
+              <w:t>IF failure_detected THEN</w:t>
+            </w:r>
+          </w:p>
+          <w:p>
+            <w:r>
+              <w:t>STATE := FAILSAFE_LEVEL_1</w:t>
+            </w:r>
+          </w:p>
+          <w:p>
+            <w:r>
+              <w:t>END IF</w:t>
+            </w:r>
+          </w:p>
+          <w:p>
+            <w:r>
+              <w:t>IF critical_failure_detected THEN</w:t>
+            </w:r>
+          </w:p>
+          <w:p>
+            <w:r>
+              <w:t>STATE := FAILSAFE_LEVEL_2</w:t>
+            </w:r>
+          </w:p>
+          <w:p>
+            <w:r>
+              <w:t>END IF</w:t>
+            </w:r>
+          </w:p>
+        </w:tc>
+      </w:tr>
+      <w:tr>
+        <w:tc>
+          <w:tcPr>
+            <w:tcW w:type="dxa" w:w="4320"/>
+          </w:tcPr>
+          <w:p>
+            <w:r>
+              <w:t>SCU_STC_SRS_2</w:t>
+            </w:r>
+          </w:p>
+        </w:tc>
+        <w:tc>
+          <w:tcPr>
+            <w:tcW w:type="dxa" w:w="4320"/>
+          </w:tcPr>
+          <w:p/>
+          <w:p>
+            <w:r>
+              <w:t>The SCU software shall implement the following state logic:</w:t>
+            </w:r>
+          </w:p>
+          <w:p>
+            <w:r>
+              <w:t>INITIAL_STATE = NORMAL</w:t>
+            </w:r>
+          </w:p>
+          <w:p>
+            <w:r>
+              <w:t>IF failure_detected THEN</w:t>
+            </w:r>
+          </w:p>
+          <w:p>
+            <w:r>
+              <w:t>STATE := FAILSAFE_LEVEL_1</w:t>
+            </w:r>
+          </w:p>
+          <w:p>
+            <w:r>
+              <w:t>END IF</w:t>
+            </w:r>
+          </w:p>
+        </w:tc>
+      </w:tr>
+      <w:tr>
+        <w:tc>
+          <w:tcPr>
+            <w:tcW w:type="dxa" w:w="4320"/>
+          </w:tcPr>
+          <w:p>
+            <w:r>
+              <w:t>SCU_STC_SRS_3</w:t>
+            </w:r>
+          </w:p>
+        </w:tc>
+        <w:tc>
+          <w:tcPr>
+            <w:tcW w:type="dxa" w:w="4320"/>
+          </w:tcPr>
+          <w:p/>
+          <w:p>
+            <w:r>
+              <w:t>The SCU software shall implement the following state logic:</w:t>
+            </w:r>
+          </w:p>
+          <w:p>
+            <w:r>
+              <w:t>INITIAL_STATE = NORMAL</w:t>
+            </w:r>
+          </w:p>
+          <w:p>
+            <w:r>
+              <w:t>IF failure_detected THEN</w:t>
+            </w:r>
+          </w:p>
+          <w:p>
+            <w:r>
+              <w:t>STATE := FAILSAFE</w:t>
+            </w:r>
+          </w:p>
+          <w:p>
+            <w:r>
+              <w:t>END IF</w:t>
+            </w:r>
+          </w:p>
+          <w:p>
+            <w:r>
+              <w:t>IF maintenance_mode_requested THEN</w:t>
+            </w:r>
+          </w:p>
+          <w:p>
+            <w:r>
+              <w:t>STATE := MAINTENANCE</w:t>
+            </w:r>
+          </w:p>
+          <w:p>
+            <w:r>
+              <w:t>END IF</w:t>
+            </w:r>
+          </w:p>
+        </w:tc>
+      </w:tr>
+      <w:tr>
+        <w:tc>
+          <w:tcPr>
+            <w:tcW w:type="dxa" w:w="4320"/>
+          </w:tcPr>
+          <w:p>
+            <w:r>
+              <w:t>SCU_STC_SRS_999</w:t>
+            </w:r>
+          </w:p>
+        </w:tc>
+        <w:tc>
+          <w:tcPr>
+            <w:tcW w:type="dxa" w:w="4320"/>
+          </w:tcPr>
+          <w:p/>
+        </w:tc>
+      </w:tr>
+      <w:tr>
+        <w:tc>
+          <w:tcPr>
+            <w:tcW w:type="dxa" w:w="4320"/>
+          </w:tcPr>
+          <w:p>
+            <w:r>
+              <w:t>SCU_STC_SRS_4</w:t>
+            </w:r>
+          </w:p>
+        </w:tc>
+        <w:tc>
+          <w:tcPr>
+            <w:tcW w:type="dxa" w:w="4320"/>
+          </w:tcPr>
+          <w:p/>
+          <w:p>
+            <w:r>
+              <w:t>The SCU software shall follow the state transitions defined below:</w:t>
+            </w:r>
+          </w:p>
+          <w:tbl>
+            <w:tblPr>
+              <w:tblStyle w:val="TableGrid"/>
+              <w:tblW w:type="auto" w:w="0"/>
+              <w:tblLook w:firstColumn="1" w:firstRow="1" w:lastColumn="0" w:lastRow="0" w:noHBand="0" w:noVBand="1" w:val="04A0"/>
+            </w:tblPr>
+            <w:tblGrid>
+              <w:gridCol w:w="1440"/>
+              <w:gridCol w:w="1440"/>
+              <w:gridCol w:w="1440"/>
+            </w:tblGrid>
+            <w:tr>
+              <w:tc>
+                <w:tcPr>
+                  <w:tcW w:type="dxa" w:w="1440"/>
+                </w:tcPr>
+                <w:p>
+                  <w:r>
+                    <w:t>FROM</w:t>
+                  </w:r>
+                </w:p>
+              </w:tc>
+              <w:tc>
+                <w:tcPr>
+                  <w:tcW w:type="dxa" w:w="1440"/>
+                </w:tcPr>
+                <w:p>
+                  <w:r>
+                    <w:t>Event</w:t>
+                  </w:r>
+                </w:p>
+              </w:tc>
+              <w:tc>
+                <w:tcPr>
+                  <w:tcW w:type="dxa" w:w="1440"/>
+                </w:tcPr>
+                <w:p>
+                  <w:r>
+                    <w:t>To</w:t>
+                  </w:r>
+                </w:p>
+              </w:tc>
+            </w:tr>
+            <w:tr>
+              <w:tc>
+                <w:tcPr>
+                  <w:tcW w:type="dxa" w:w="1440"/>
+                </w:tcPr>
+                <w:p>
+                  <w:r>
+                    <w:t>Normal</w:t>
+                  </w:r>
+                </w:p>
+              </w:tc>
+              <w:tc>
+                <w:tcPr>
+                  <w:tcW w:type="dxa" w:w="1440"/>
+                </w:tcPr>
+                <w:p>
+                  <w:r>
+                    <w:t>Failure_detected</w:t>
+                  </w:r>
+                </w:p>
+              </w:tc>
+              <w:tc>
+                <w:tcPr>
+                  <w:tcW w:type="dxa" w:w="1440"/>
+                </w:tcPr>
+                <w:p>
+                  <w:r>
+                    <w:t>FAILSAFE_LEVEL_1</w:t>
+                  </w:r>
+                </w:p>
+              </w:tc>
+            </w:tr>
+          </w:tbl>
+          <w:p/>
         </w:tc>
       </w:tr>
     </w:tbl>

</xml_diff>